<commit_message>
docs: realinear Plan_MVP.docx a la propuesta de colaboración
El MVP real del cliente (31 oct) es arqueo/cierre de caja, modificadores,
devoluciones/errores, comensal QR y pagos reales (Mercado Pago/Transbank).
Se agrega sección "extra" con lo que el modelo interno tiene y la propuesta
no pide (reservas, S.O.S., feedback, favoritos, DTE/SII, what-if, RRHH).
Inventario queda en la 1ra versión (30 nov). Se documenta el gap de
arqueo/caja (sin entidad en el modelo de 29).
</commit_message>
<xml_diff>
--- a/Plan_MVP.docx
+++ b/Plan_MVP.docx
@@ -7,7 +7,7 @@
         <w:pStyle w:val="Title"/>
       </w:pPr>
       <w:r>
-        <w:t>LabTab v3 — Plan de la Fase MVP</w:t>
+        <w:t>LabTab v3 — Plan de la Fase MVP (alineado a la propuesta de colaboración)</w:t>
       </w:r>
     </w:p>
     <w:p>
@@ -15,7 +15,7 @@
         <w:rPr>
           <w:b/>
         </w:rPr>
-        <w:t>Planificación: alcance, dominios, entidades, integraciones y fases · Stack: Java 21 + Spring Boot 3.5.16 + PostgreSQL 16</w:t>
+        <w:t>Alcance real del cliente · lo que tenemos extra · fases y fechas · Stack: Java 21 + Spring Boot 3.5.16 + PostgreSQL 16 (backend)</w:t>
       </w:r>
     </w:p>
     <w:p>
@@ -23,28 +23,12 @@
         <w:pStyle w:val="Heading1"/>
       </w:pPr>
       <w:r>
-        <w:t>1. Resumen ejecutivo</w:t>
+        <w:t>1. Contexto: la propuesta de colaboración</w:t>
       </w:r>
     </w:p>
     <w:p>
       <w:r>
-        <w:t>El Hito Alfa entregó el flujo operado por el staff (mozo, cocina, cobro) sobre 20 de las 29 entidades del modelo de datos. La fase MVP completa la visión del producto: experiencia del comensal por QR (S.O.S., reservas, feedback, favoritos), back-office operativo (inventario, recetas, DTE/SII) e integraciones externas (SII, Transbank, MercadoPago, delivery). MVP incorpora las 9 entidades restantes del modelo y resuelve dos decisiones de arquitectura pendientes (alcance de RRHH y reconciliación de enums).</w:t>
-      </w:r>
-    </w:p>
-    <w:p>
-      <w:pPr>
-        <w:pStyle w:val="Heading1"/>
-      </w:pPr>
-      <w:r>
-        <w:t>2. Alcance</w:t>
-      </w:r>
-    </w:p>
-    <w:p>
-      <w:r>
-        <w:rPr>
-          <w:b/>
-        </w:rPr>
-        <w:t>Entra en MVP (9 entidades):</w:t>
+        <w:t>El proyecto se divide en cuatro hitos con fecha y pago contra entrega:</w:t>
       </w:r>
     </w:p>
     <w:tbl>
@@ -54,33 +38,47 @@
         <w:tblLook w:firstColumn="1" w:firstRow="1" w:lastColumn="0" w:lastRow="0" w:noHBand="0" w:noVBand="1" w:val="04A0"/>
       </w:tblPr>
       <w:tblGrid>
-        <w:gridCol w:w="4320"/>
-        <w:gridCol w:w="4320"/>
+        <w:gridCol w:w="2880"/>
+        <w:gridCol w:w="2880"/>
+        <w:gridCol w:w="2880"/>
       </w:tblGrid>
       <w:tr>
         <w:tc>
           <w:tcPr>
-            <w:tcW w:type="dxa" w:w="4320"/>
+            <w:tcW w:type="dxa" w:w="2880"/>
           </w:tcPr>
           <w:p>
             <w:r>
               <w:rPr>
                 <w:b/>
               </w:rPr>
-              <w:t>Dominio</w:t>
+              <w:t>Hito</w:t>
             </w:r>
           </w:p>
         </w:tc>
         <w:tc>
           <w:tcPr>
-            <w:tcW w:type="dxa" w:w="4320"/>
+            <w:tcW w:type="dxa" w:w="2880"/>
           </w:tcPr>
           <w:p>
             <w:r>
               <w:rPr>
                 <w:b/>
               </w:rPr>
-              <w:t>Entidades</w:t>
+              <w:t>Fecha</w:t>
+            </w:r>
+          </w:p>
+        </w:tc>
+        <w:tc>
+          <w:tcPr>
+            <w:tcW w:type="dxa" w:w="2880"/>
+          </w:tcPr>
+          <w:p>
+            <w:r>
+              <w:rPr>
+                <w:b/>
+              </w:rPr>
+              <w:t>Monto</w:t>
             </w:r>
           </w:p>
         </w:tc>
@@ -88,21 +86,31 @@
       <w:tr>
         <w:tc>
           <w:tcPr>
-            <w:tcW w:type="dxa" w:w="4320"/>
+            <w:tcW w:type="dxa" w:w="2880"/>
           </w:tcPr>
           <w:p>
             <w:r>
-              <w:t>DTE / SII y medios de pago</w:t>
+              <w:t>Auditoría y plan aceptados</w:t>
             </w:r>
           </w:p>
         </w:tc>
         <w:tc>
           <w:tcPr>
-            <w:tcW w:type="dxa" w:w="4320"/>
+            <w:tcW w:type="dxa" w:w="2880"/>
           </w:tcPr>
           <w:p>
             <w:r>
-              <w:t>TAX_DOCUMENT, SII_CAF_POOL, PAYMENT_METHOD</w:t>
+              <w:t>1 de septiembre</w:t>
+            </w:r>
+          </w:p>
+        </w:tc>
+        <w:tc>
+          <w:tcPr>
+            <w:tcW w:type="dxa" w:w="2880"/>
+          </w:tcPr>
+          <w:p>
+            <w:r>
+              <w:t>$300.000</w:t>
             </w:r>
           </w:p>
         </w:tc>
@@ -110,21 +118,31 @@
       <w:tr>
         <w:tc>
           <w:tcPr>
-            <w:tcW w:type="dxa" w:w="4320"/>
+            <w:tcW w:type="dxa" w:w="2880"/>
           </w:tcPr>
           <w:p>
             <w:r>
-              <w:t>Reservas</w:t>
+              <w:t>Alfa</w:t>
             </w:r>
           </w:p>
         </w:tc>
         <w:tc>
           <w:tcPr>
-            <w:tcW w:type="dxa" w:w="4320"/>
+            <w:tcW w:type="dxa" w:w="2880"/>
           </w:tcPr>
           <w:p>
             <w:r>
-              <w:t>RESERVATION</w:t>
+              <w:t>30 de septiembre</w:t>
+            </w:r>
+          </w:p>
+        </w:tc>
+        <w:tc>
+          <w:tcPr>
+            <w:tcW w:type="dxa" w:w="2880"/>
+          </w:tcPr>
+          <w:p>
+            <w:r>
+              <w:t>$450.000</w:t>
             </w:r>
           </w:p>
         </w:tc>
@@ -132,21 +150,31 @@
       <w:tr>
         <w:tc>
           <w:tcPr>
-            <w:tcW w:type="dxa" w:w="4320"/>
+            <w:tcW w:type="dxa" w:w="2880"/>
           </w:tcPr>
           <w:p>
             <w:r>
-              <w:t>Llamados del cliente (S.O.S.)</w:t>
+              <w:t>MVP</w:t>
             </w:r>
           </w:p>
         </w:tc>
         <w:tc>
           <w:tcPr>
-            <w:tcW w:type="dxa" w:w="4320"/>
+            <w:tcW w:type="dxa" w:w="2880"/>
           </w:tcPr>
           <w:p>
             <w:r>
-              <w:t>SERVICE_REQUEST</w:t>
+              <w:t>31 de octubre</w:t>
+            </w:r>
+          </w:p>
+        </w:tc>
+        <w:tc>
+          <w:tcPr>
+            <w:tcW w:type="dxa" w:w="2880"/>
+          </w:tcPr>
+          <w:p>
+            <w:r>
+              <w:t>$450.000</w:t>
             </w:r>
           </w:p>
         </w:tc>
@@ -154,21 +182,31 @@
       <w:tr>
         <w:tc>
           <w:tcPr>
-            <w:tcW w:type="dxa" w:w="4320"/>
+            <w:tcW w:type="dxa" w:w="2880"/>
           </w:tcPr>
           <w:p>
             <w:r>
-              <w:t>Feedback y favoritos</w:t>
+              <w:t>Primera versión completa</w:t>
             </w:r>
           </w:p>
         </w:tc>
         <w:tc>
           <w:tcPr>
-            <w:tcW w:type="dxa" w:w="4320"/>
+            <w:tcW w:type="dxa" w:w="2880"/>
           </w:tcPr>
           <w:p>
             <w:r>
-              <w:t>DINE_FEEDBACK, FAVORITE</w:t>
+              <w:t>30 de noviembre</w:t>
+            </w:r>
+          </w:p>
+        </w:tc>
+        <w:tc>
+          <w:tcPr>
+            <w:tcW w:type="dxa" w:w="2880"/>
+          </w:tcPr>
+          <w:p>
+            <w:r>
+              <w:t>$450.000</w:t>
             </w:r>
           </w:p>
         </w:tc>
@@ -176,32 +214,52 @@
       <w:tr>
         <w:tc>
           <w:tcPr>
-            <w:tcW w:type="dxa" w:w="4320"/>
+            <w:tcW w:type="dxa" w:w="2880"/>
           </w:tcPr>
           <w:p>
             <w:r>
-              <w:t>Inventario y recetas</w:t>
+              <w:t>Producto terminado</w:t>
             </w:r>
           </w:p>
         </w:tc>
         <w:tc>
           <w:tcPr>
-            <w:tcW w:type="dxa" w:w="4320"/>
+            <w:tcW w:type="dxa" w:w="2880"/>
           </w:tcPr>
           <w:p>
             <w:r>
-              <w:t>STOCK_ITEM, RECIPE_INGREDIENT</w:t>
+              <w:t>31 de diciembre</w:t>
+            </w:r>
+          </w:p>
+        </w:tc>
+        <w:tc>
+          <w:tcPr>
+            <w:tcW w:type="dxa" w:w="2880"/>
+          </w:tcPr>
+          <w:p>
+            <w:r>
+              <w:t>$350.000</w:t>
             </w:r>
           </w:p>
         </w:tc>
       </w:tr>
     </w:tbl>
+    <w:p/>
     <w:p>
+      <w:pPr>
+        <w:pStyle w:val="ListBullet"/>
+      </w:pPr>
       <w:r>
         <w:rPr>
           <w:b/>
         </w:rPr>
-        <w:t>Requiere decisión de arquitectura (fuera del modelo de 29):</w:t>
+        <w:t xml:space="preserve">Stack: </w:t>
+      </w:r>
+      <w:r>
+        <w:rPr>
+          <w:b w:val="0"/>
+        </w:rPr>
+        <w:t>el cliente propone como hipótesis unificar web + app en JavaScript/TypeScript con React Native y Expo; el backend Java + Spring Boot es la decisión justificada en la auditoría (se mantiene).</w:t>
       </w:r>
     </w:p>
     <w:p>
@@ -212,10 +270,13 @@
         <w:rPr>
           <w:b/>
         </w:rPr>
-        <w:t xml:space="preserve">RRHH (turnos/asistencia): </w:t>
+        <w:t xml:space="preserve">Diseño: </w:t>
       </w:r>
       <w:r>
-        <w:t>no existe entidad en el diagrama de 29. Se debe decidir entre crear una entidad nueva (p. ej. SHIFT/ATTENDANCE) o mantener el módulo como mock de frontend. No se inicia antes de documentar esa decisión.</w:t>
+        <w:rPr>
+          <w:b w:val="0"/>
+        </w:rPr>
+        <w:t>la arquitectura de marca, sistema de diseño, UX y UI están a cargo de una diseñadora externa; el desarrollo recibe eso resuelto.</w:t>
       </w:r>
     </w:p>
     <w:p>
@@ -226,31 +287,13 @@
         <w:rPr>
           <w:b/>
         </w:rPr>
-        <w:t xml:space="preserve">What-if / análisis: </w:t>
+        <w:t xml:space="preserve">Trabajo: </w:t>
       </w:r>
       <w:r>
-        <w:t>es un simulador de frontend (Super Admin) sin entidad propia; depende de las fichas técnicas de receta costeadas.</w:t>
-      </w:r>
-    </w:p>
-    <w:p>
-      <w:r>
         <w:rPr>
-          <w:b/>
+          <w:b w:val="0"/>
         </w:rPr>
-        <w:t>Corrección de alcance del brief de Alfa:</w:t>
-      </w:r>
-    </w:p>
-    <w:p>
-      <w:r>
-        <w:t>El brief decía "17 de 29" entidades en Alfa, pero su tabla lista 20; y decía "12 para MVP", pero son 9. La realidad verificada contra el diagrama y el código es 20 (Alfa) + 9 (MVP) = 29. No hay entidades "faltantes".</w:t>
-      </w:r>
-    </w:p>
-    <w:p>
-      <w:pPr>
-        <w:pStyle w:val="Heading1"/>
-      </w:pPr>
-      <w:r>
-        <w:t>3. Las 9 entidades MVP</w:t>
+        <w:t>prestación de servicios por proyecto; demo funcional cada dos semanas; criterios de aceptación escritos antes de cada hito; código en la organización de GitHub desde el día uno.</w:t>
       </w:r>
     </w:p>
     <w:p>
@@ -261,10 +304,118 @@
         <w:rPr>
           <w:b/>
         </w:rPr>
-        <w:t>TAX_DOCUMENT</w:t>
+        <w:t xml:space="preserve">Condiciones de la opción societaria (hasta 15%): </w:t>
       </w:r>
       <w:r>
-        <w:t xml:space="preserve"> — Documento tributario electrónico (DTE) por cuenta pagada. Campos: type (boleta/factura), buyer_rut, buyer_business_name, folio_number, sii_status (issued/pending/contingency), pdf_url. FK: BILL, BRANCH.</w:t>
+        <w:rPr>
+          <w:b w:val="0"/>
+        </w:rPr>
+        <w:t>los cuatro hitos entregados en plazo, sin vulnerabilidades críticas abiertas al 31/12, pagos reales en producción, documentación técnica transferible, y ritmo de demos quincenales cumplido.</w:t>
+      </w:r>
+    </w:p>
+    <w:p>
+      <w:pPr>
+        <w:pStyle w:val="Heading1"/>
+      </w:pPr>
+      <w:r>
+        <w:t>2. Alcance del MVP según la propuesta (31 de octubre)</w:t>
+      </w:r>
+    </w:p>
+    <w:p>
+      <w:r>
+        <w:t>Lo que el cliente pidió explícitamente para el MVP:</w:t>
+      </w:r>
+    </w:p>
+    <w:p>
+      <w:pPr>
+        <w:pStyle w:val="ListNumber"/>
+      </w:pPr>
+      <w:r>
+        <w:rPr>
+          <w:b/>
+        </w:rPr>
+        <w:t>Arqueo y cierre de caja</w:t>
+      </w:r>
+      <w:r>
+        <w:rPr>
+          <w:b w:val="0"/>
+        </w:rPr>
+        <w:t xml:space="preserve"> con doble jornada y varios turnos.</w:t>
+      </w:r>
+    </w:p>
+    <w:p>
+      <w:pPr>
+        <w:pStyle w:val="ListNumber"/>
+      </w:pPr>
+      <w:r>
+        <w:rPr>
+          <w:b/>
+        </w:rPr>
+        <w:t>Modificadores y adicionales</w:t>
+      </w:r>
+      <w:r>
+        <w:rPr>
+          <w:b w:val="0"/>
+        </w:rPr>
+        <w:t xml:space="preserve"> en la comanda.</w:t>
+      </w:r>
+    </w:p>
+    <w:p>
+      <w:pPr>
+        <w:pStyle w:val="ListNumber"/>
+      </w:pPr>
+      <w:r>
+        <w:rPr>
+          <w:b/>
+        </w:rPr>
+        <w:t>Manejo de errores y devoluciones.</w:t>
+      </w:r>
+    </w:p>
+    <w:p>
+      <w:pPr>
+        <w:pStyle w:val="ListNumber"/>
+      </w:pPr>
+      <w:r>
+        <w:rPr>
+          <w:b/>
+        </w:rPr>
+        <w:t>Interfaz del comensal por QR</w:t>
+      </w:r>
+      <w:r>
+        <w:rPr>
+          <w:b w:val="0"/>
+        </w:rPr>
+        <w:t xml:space="preserve"> (web app): escanea → se une a la mesa → pide → ve su subtotal → paga lo suyo.</w:t>
+      </w:r>
+    </w:p>
+    <w:p>
+      <w:pPr>
+        <w:pStyle w:val="ListNumber"/>
+      </w:pPr>
+      <w:r>
+        <w:rPr>
+          <w:b/>
+        </w:rPr>
+        <w:t>Pagos reales</w:t>
+      </w:r>
+      <w:r>
+        <w:rPr>
+          <w:b w:val="0"/>
+        </w:rPr>
+        <w:t>: Mercado Pago para partir, Transbank al escalar.</w:t>
+      </w:r>
+    </w:p>
+    <w:p>
+      <w:r>
+        <w:t>En paralelo, el cliente corre la campaña Early Bird (meta comercial del cliente, no de desarrollo).</w:t>
+      </w:r>
+    </w:p>
+    <w:p>
+      <w:pPr>
+        <w:pStyle w:val="Heading1"/>
+      </w:pPr>
+      <w:r>
+        <w:t>3. Mapeo: lo que pide el cliente y qué lo cubre</w:t>
       </w:r>
     </w:p>
     <w:p>
@@ -275,10 +426,13 @@
         <w:rPr>
           <w:b/>
         </w:rPr>
-        <w:t>SII_CAF_POOL</w:t>
+        <w:t>Comensal por QR</w:t>
       </w:r>
       <w:r>
-        <w:t xml:space="preserve"> — Rango de folios CAF. Campos: document_type, folio_from/folio_to, last_used_folio, caf_xml, is_active. FK: BRANCH.</w:t>
+        <w:rPr>
+          <w:b w:val="0"/>
+        </w:rPr>
+        <w:t xml:space="preserve"> → reutiliza DINE_SESSION / DINE_GUEST (ya en Alfa) + endpoints de comensal (pedir, ver subtotal, pagar). Parcialmente existente (guest-session ya genera JWT GUEST).</w:t>
       </w:r>
     </w:p>
     <w:p>
@@ -289,10 +443,13 @@
         <w:rPr>
           <w:b/>
         </w:rPr>
-        <w:t>PAYMENT_METHOD</w:t>
+        <w:t>Pagos reales</w:t>
       </w:r>
       <w:r>
-        <w:t xml:space="preserve"> — Medio de pago guardado (token, nunca PAN). Campos: provider, brand, last4, exp_month/year, token, wallet_id, is_default. FK: PERSON.</w:t>
+        <w:rPr>
+          <w:b w:val="0"/>
+        </w:rPr>
+        <w:t xml:space="preserve"> → entidad PAYMENT (existente) + PAYMENT_METHOD (token de gateway, nunca PAN) + patrón PaymentGatewayStrategy para Mercado Pago y Transbank.</w:t>
       </w:r>
     </w:p>
     <w:p>
@@ -303,10 +460,13 @@
         <w:rPr>
           <w:b/>
         </w:rPr>
-        <w:t>RESERVATION</w:t>
+        <w:t>Modificadores y adicionales</w:t>
       </w:r>
       <w:r>
-        <w:t xml:space="preserve"> — Reserva y lista de espera. Campos: guest_name/email/phone, party_size, reservation_date/time, status (confirmed/waitlisted/cancelled/completed/no_show), waitlist_priority, dining_table_id. FK: BRANCH, PERSON (nullable), DINING_TABLE (nullable).</w:t>
+        <w:rPr>
+          <w:b w:val="0"/>
+        </w:rPr>
+        <w:t xml:space="preserve"> → ORDER_LINE.modifiers (ya existe en Alfa); se robustece.</w:t>
       </w:r>
     </w:p>
     <w:p>
@@ -317,10 +477,13 @@
         <w:rPr>
           <w:b/>
         </w:rPr>
-        <w:t>SERVICE_REQUEST</w:t>
+        <w:t>Devoluciones y errores</w:t>
       </w:r>
       <w:r>
-        <w:t xml:space="preserve"> — Llamado S.O.S. del comensal. Campos: dine_session_id, table_name (snapshot), request_type (waiter/bill/water/other), status (open/accepted/resolved), accepted_by/at, resolved_at. FK: BRANCH, DINE_SESSION, PERSON (accepted_by).</w:t>
+        <w:rPr>
+          <w:b w:val="0"/>
+        </w:rPr>
+        <w:t xml:space="preserve"> → PAYMENT refund (existente) + manejo de errores por turno.</w:t>
       </w:r>
     </w:p>
     <w:p>
@@ -331,10 +494,38 @@
         <w:rPr>
           <w:b/>
         </w:rPr>
-        <w:t>DINE_FEEDBACK</w:t>
+        <w:t>Arqueo y cierre de caja</w:t>
       </w:r>
       <w:r>
-        <w:t xml:space="preserve"> — Calificación post-pago. Campos: dine_session_id, person_id, rating (CHECK 1–5), comment. FK: DINE_SESSION, PERSON (nullable).</w:t>
+        <w:rPr>
+          <w:b w:val="0"/>
+        </w:rPr>
+        <w:t xml:space="preserve"> → </w:t>
+      </w:r>
+      <w:r>
+        <w:rPr>
+          <w:b/>
+        </w:rPr>
+        <w:t>GAP: no existe entidad en el modelo de 29.</w:t>
+      </w:r>
+      <w:r>
+        <w:rPr>
+          <w:b w:val="0"/>
+        </w:rPr>
+        <w:t xml:space="preserve"> Requiere decisión de arquitectura (nueva entidad de arqueo/turno de caja, p. ej. CASH_DRAWER + SHIFT), igual que RRHH.</w:t>
+      </w:r>
+    </w:p>
+    <w:p>
+      <w:pPr>
+        <w:pStyle w:val="Heading1"/>
+      </w:pPr>
+      <w:r>
+        <w:t>4. Extra — lo que tenemos nosotros que no pide la propuesta</w:t>
+      </w:r>
+    </w:p>
+    <w:p>
+      <w:r>
+        <w:t>Estas capacidades están en el modelo interno de 29 entidades pero NO figuran en la propuesta del cliente. Quedan documentadas como valor adicional y se priorizan después del MVP:</w:t>
       </w:r>
     </w:p>
     <w:p>
@@ -345,10 +536,13 @@
         <w:rPr>
           <w:b/>
         </w:rPr>
-        <w:t>FAVORITE</w:t>
+        <w:t>Reservas</w:t>
       </w:r>
       <w:r>
-        <w:t xml:space="preserve"> — Sucursal favorita del usuario. Campos: person_id, branch_id, created_at. FK: PERSON, BRANCH.</w:t>
+        <w:rPr>
+          <w:b w:val="0"/>
+        </w:rPr>
+        <w:t xml:space="preserve"> (RESERVATION): reserva y lista de espera, estados confirmed/waitlisted/cancelled/completed/no_show.</w:t>
       </w:r>
     </w:p>
     <w:p>
@@ -359,10 +553,13 @@
         <w:rPr>
           <w:b/>
         </w:rPr>
-        <w:t>STOCK_ITEM</w:t>
+        <w:t>S.O.S. / llamados del comensal</w:t>
       </w:r>
       <w:r>
-        <w:t xml:space="preserve"> — Insumo/ingrediente. Campos: branch_id, name, stock_quantity, unit (gramos/unidades/litros). FK: BRANCH.</w:t>
+        <w:rPr>
+          <w:b w:val="0"/>
+        </w:rPr>
+        <w:t xml:space="preserve"> (SERVICE_REQUEST): call.waiter con escalado automático a los 3 minutos.</w:t>
       </w:r>
     </w:p>
     <w:p>
@@ -373,103 +570,13 @@
         <w:rPr>
           <w:b/>
         </w:rPr>
-        <w:t>RECIPE_INGREDIENT</w:t>
+        <w:t>Feedback</w:t>
       </w:r>
       <w:r>
-        <w:t xml:space="preserve"> — Escandallo / ficha técnica. Campos: dish_id, stock_item_id, quantity_required. FK: DISH, STOCK_ITEM.</w:t>
-      </w:r>
-    </w:p>
-    <w:p>
-      <w:pPr>
-        <w:pStyle w:val="Heading1"/>
-      </w:pPr>
-      <w:r>
-        <w:t>4. Dominios y funcionalidades</w:t>
-      </w:r>
-    </w:p>
-    <w:p>
-      <w:r>
         <w:rPr>
-          <w:b/>
+          <w:b w:val="0"/>
         </w:rPr>
-        <w:t>4.1 Reservas</w:t>
-      </w:r>
-      <w:r>
-        <w:t xml:space="preserve"> — RESERVATION. Endpoints: POST /reservations, GET /reservations, PATCH /reservations/{id}/status. Reglas: ciclo de estados confirmed → waitlisted/cancelled/completed/no_show; mesa asignada al llegar (dining_table_id nullable); party_size &gt; 0; waitlist_priority para la Fila Virtual. Sin evento WebSocket documentado.</w:t>
-      </w:r>
-    </w:p>
-    <w:p>
-      <w:r>
-        <w:rPr>
-          <w:b/>
-        </w:rPr>
-        <w:t>4.2 S.O.S. / llamados</w:t>
-      </w:r>
-      <w:r>
-        <w:t xml:space="preserve"> — SERVICE_REQUEST. Endpoints: POST /service-requests, PATCH /service-requests/{id}/accept, PATCH /service-requests/{id}/resolve. WebSocket: call.waiter (motivos "Limpiar mesa | Falta cubierto | Ayuda general"). Regla de escalado: si a los 3 minutos el mozo no responde, se escala al jefe de salón.</w:t>
-      </w:r>
-    </w:p>
-    <w:p>
-      <w:r>
-        <w:rPr>
-          <w:b/>
-        </w:rPr>
-        <w:t>4.3 Inventario y recetas</w:t>
-      </w:r>
-      <w:r>
-        <w:t xml:space="preserve"> — STOCK_ITEM, RECIPE_INGREDIENT. Endpoints: GET /stock, PATCH /stock/{stockItemId}/quantity (merma in-place con reason). Reglas: unit ∈ gramos/unidades/litros; quantity_required = escandallo por porción (ficha técnica que habilita What-if y Costo Primario); se vincula con la Lista 86 de Alfa (DISH.is_available + kds.stock_86).</w:t>
-      </w:r>
-    </w:p>
-    <w:p>
-      <w:r>
-        <w:rPr>
-          <w:b/>
-        </w:rPr>
-        <w:t>4.4 DTE / SII y medios de pago</w:t>
-      </w:r>
-      <w:r>
-        <w:t xml:space="preserve"> — TAX_DOCUMENT, SII_CAF_POOL, PAYMENT_METHOD. Endpoints: POST /tax-documents, GET /tax-documents/{dteId}, GET /bills/{billId}/tax-document, y POST /payments/webhook/{provider} (declarado MVP, firma HMAC). WebSocket: dte.folio_used (alerta &lt;50 naranja, &lt;10 rojo). Reglas: DTE se emite al pasar BILL a paid; CAF con lock pesimista para no repetir folio; folio_number UNIQUE por sucursal; Modo Contingencia si SII no responde (reintento @Scheduled cada 15 min, la caja nunca se bloquea).</w:t>
-      </w:r>
-    </w:p>
-    <w:p>
-      <w:r>
-        <w:rPr>
-          <w:b/>
-        </w:rPr>
-        <w:t>4.5 Feedback y favoritos</w:t>
-      </w:r>
-      <w:r>
-        <w:t xml:space="preserve"> — DINE_FEEDBACK, FAVORITE. Endpoints: POST /feedback, GET /feedback (FAVORITE sin endpoint documentado — gap de spec). Reglas: rating 1–5; un feedback por sesión (409 en duplicado); 5★ alimenta el leaderboard del mozo, 1–2★ despliega campo de texto para interceptar malas reseñas.</w:t>
-      </w:r>
-    </w:p>
-    <w:p>
-      <w:r>
-        <w:rPr>
-          <w:b/>
-        </w:rPr>
-        <w:t>4.6 What-if / análisis</w:t>
-      </w:r>
-      <w:r>
-        <w:t xml:space="preserve"> — Sin entidad ni endpoint; simulador de Super Admin (sliders de costo de insumo/precio de venta que recalculan Costo Primario y Margen Neto). Dependencia dura: recetas costeadas (4.3).</w:t>
-      </w:r>
-    </w:p>
-    <w:p>
-      <w:r>
-        <w:rPr>
-          <w:b/>
-        </w:rPr>
-        <w:t>4.7 RRHH</w:t>
-      </w:r>
-      <w:r>
-        <w:t xml:space="preserve"> — Sin entidad ni endpoint en el backend. Solo eventos WebSocket: shift.clock_in/shift.clock_out (Ley 40 Horas) y panic.button. Requiere decisión de arquitectura antes de iniciar (ver sección 2).</w:t>
-      </w:r>
-    </w:p>
-    <w:p>
-      <w:pPr>
-        <w:pStyle w:val="Heading1"/>
-      </w:pPr>
-      <w:r>
-        <w:t>5. Integraciones externas</w:t>
+        <w:t xml:space="preserve"> (DINE_FEEDBACK): calificación 1–5 post-pago, una por sesión.</w:t>
       </w:r>
     </w:p>
     <w:p>
@@ -480,10 +587,13 @@
         <w:rPr>
           <w:b/>
         </w:rPr>
-        <w:t xml:space="preserve">SII Chile: </w:t>
+        <w:t>Favoritos</w:t>
       </w:r>
       <w:r>
-        <w:t>Boleta = código 39 (sin RUT), Factura = código 33 (requiere RUT + razón social). SOAP DTEUpload; Modo Contingencia con reintento async.</w:t>
+        <w:rPr>
+          <w:b w:val="0"/>
+        </w:rPr>
+        <w:t xml:space="preserve"> (FAVORITE): sucursal favorita del usuario.</w:t>
       </w:r>
     </w:p>
     <w:p>
@@ -494,10 +604,13 @@
         <w:rPr>
           <w:b/>
         </w:rPr>
-        <w:t xml:space="preserve">Transbank Webpay Plus: </w:t>
+        <w:t>DTE / SII</w:t>
       </w:r>
       <w:r>
-        <w:t>credenciales sandbox, generación de buy_order, flujo de commit por webhook.</w:t>
+        <w:rPr>
+          <w:b w:val="0"/>
+        </w:rPr>
+        <w:t xml:space="preserve"> (TAX_DOCUMENT, SII_CAF_POOL): facturación electrónica chilena (boleta/factura, folios CAF, Modo Contingencia).</w:t>
       </w:r>
     </w:p>
     <w:p>
@@ -508,10 +621,234 @@
         <w:rPr>
           <w:b/>
         </w:rPr>
-        <w:t xml:space="preserve">MercadoPago QR dinámico: </w:t>
+        <w:t>Simulador What-if</w:t>
       </w:r>
       <w:r>
-        <w:t>IPN con validación HMAC x-signature, verificación vía GET /v1/payments/{id}.</w:t>
+        <w:rPr>
+          <w:b w:val="0"/>
+        </w:rPr>
+        <w:t>: analíticas avanzadas (Costo Primario y Margen Neto sobre recetas costeadas).</w:t>
+      </w:r>
+    </w:p>
+    <w:p>
+      <w:pPr>
+        <w:pStyle w:val="ListBullet"/>
+      </w:pPr>
+      <w:r>
+        <w:rPr>
+          <w:b/>
+        </w:rPr>
+        <w:t>RRHH / turnos</w:t>
+      </w:r>
+      <w:r>
+        <w:rPr>
+          <w:b w:val="0"/>
+        </w:rPr>
+        <w:t xml:space="preserve"> (Ley 40 Horas): control de turnos y asistencia.</w:t>
+      </w:r>
+    </w:p>
+    <w:p>
+      <w:r>
+        <w:t>Nota: el inventario (STOCK_ITEM, RECIPE_INGREDIENT) SÍ está en la propuesta, pero en la "Primera versión completa" (30 de noviembre), no en el MVP.</w:t>
+      </w:r>
+    </w:p>
+    <w:p>
+      <w:pPr>
+        <w:pStyle w:val="Heading1"/>
+      </w:pPr>
+      <w:r>
+        <w:t>5. Plan por fases alineado a las cuatro fechas</w:t>
+      </w:r>
+    </w:p>
+    <w:p>
+      <w:pPr>
+        <w:pStyle w:val="ListBullet"/>
+      </w:pPr>
+      <w:r>
+        <w:rPr>
+          <w:b/>
+        </w:rPr>
+        <w:t>Alfa (30 sept)</w:t>
+      </w:r>
+      <w:r>
+        <w:rPr>
+          <w:b w:val="0"/>
+        </w:rPr>
+        <w:t xml:space="preserve"> — cerrado: comanda, menú, cocina, cobro y split por el garzón + 3 vulnerabilidades críticas.</w:t>
+      </w:r>
+    </w:p>
+    <w:p>
+      <w:pPr>
+        <w:pStyle w:val="ListBullet"/>
+      </w:pPr>
+      <w:r>
+        <w:rPr>
+          <w:b/>
+        </w:rPr>
+        <w:t>MVP (31 oct)</w:t>
+      </w:r>
+      <w:r>
+        <w:rPr>
+          <w:b w:val="0"/>
+        </w:rPr>
+        <w:t xml:space="preserve"> — arqueo/cierre de caja, modificadores, devoluciones/errores, comensal QR, pagos reales (Mercado Pago/Transbank). Antes de implementar, decidir el modelo de arqueo/caja (gap de la sección 3).</w:t>
+      </w:r>
+    </w:p>
+    <w:p>
+      <w:pPr>
+        <w:pStyle w:val="ListBullet"/>
+      </w:pPr>
+      <w:r>
+        <w:rPr>
+          <w:b/>
+        </w:rPr>
+        <w:t>Primera versión completa (30 nov)</w:t>
+      </w:r>
+      <w:r>
+        <w:rPr>
+          <w:b w:val="0"/>
+        </w:rPr>
+        <w:t xml:space="preserve"> — inventario conectado a cocina y carta QR (STOCK_ITEM, RECIPE_INGREDIENT), analíticas para el dueño, logs de errores por turno.</w:t>
+      </w:r>
+    </w:p>
+    <w:p>
+      <w:pPr>
+        <w:pStyle w:val="ListBullet"/>
+      </w:pPr>
+      <w:r>
+        <w:rPr>
+          <w:b/>
+        </w:rPr>
+        <w:t>Producto terminado (31 dic)</w:t>
+      </w:r>
+      <w:r>
+        <w:rPr>
+          <w:b w:val="0"/>
+        </w:rPr>
+        <w:t xml:space="preserve"> — app descargable (App Store/Google Play), interfaz del local estable en producción, documentación técnica al día.</w:t>
+      </w:r>
+    </w:p>
+    <w:p>
+      <w:r>
+        <w:t>Las capacidades "extra" (reservas, S.O.S., feedback, favoritos, DTE/SII, What-if, RRHH) se priorizan después del MVP, según el roadmap de producto.</w:t>
+      </w:r>
+    </w:p>
+    <w:p>
+      <w:pPr>
+        <w:pStyle w:val="Heading1"/>
+      </w:pPr>
+      <w:r>
+        <w:t>6. Entidades involucradas</w:t>
+      </w:r>
+    </w:p>
+    <w:p>
+      <w:pPr>
+        <w:pStyle w:val="ListBullet"/>
+      </w:pPr>
+      <w:r>
+        <w:rPr>
+          <w:b/>
+        </w:rPr>
+        <w:t>Existentes (Alfa, 20)</w:t>
+      </w:r>
+      <w:r>
+        <w:rPr>
+          <w:b w:val="0"/>
+        </w:rPr>
+        <w:t>: PERSON, PERSON_PROFILE, COMPANY, COMPANY_ROLE, BRANCH, BRANCH_ROLE, DINING_FLOOR, MAP_ZONE, DINING_TABLE, DINE_SESSION, DINE_GUEST, MENU_SECTION, DISH, ORDER, ORDER_LINE, KITCHEN_TICKET, BILL, BILL_LINE, PAYMENT, EXCEPTION_LOG.</w:t>
+      </w:r>
+    </w:p>
+    <w:p>
+      <w:pPr>
+        <w:pStyle w:val="ListBullet"/>
+      </w:pPr>
+      <w:r>
+        <w:rPr>
+          <w:b/>
+        </w:rPr>
+        <w:t>MVP nuevas (según propuesta)</w:t>
+      </w:r>
+      <w:r>
+        <w:rPr>
+          <w:b w:val="0"/>
+        </w:rPr>
+        <w:t>: PAYMENT_METHOD (token de pago guardado). Arqueo/caja requiere una entidad nueva a definir (fuera del modelo de 29).</w:t>
+      </w:r>
+    </w:p>
+    <w:p>
+      <w:pPr>
+        <w:pStyle w:val="ListBullet"/>
+      </w:pPr>
+      <w:r>
+        <w:rPr>
+          <w:b/>
+        </w:rPr>
+        <w:t>Extra (nuestro modelo)</w:t>
+      </w:r>
+      <w:r>
+        <w:rPr>
+          <w:b w:val="0"/>
+        </w:rPr>
+        <w:t>: RESERVATION, SERVICE_REQUEST, DINE_FEEDBACK, FAVORITE, TAX_DOCUMENT, SII_CAF_POOL, STOCK_ITEM, RECIPE_INGREDIENT (STOCK_ITEM/RECIPE_INGREDIENT van en la 1ra versión).</w:t>
+      </w:r>
+    </w:p>
+    <w:p>
+      <w:pPr>
+        <w:pStyle w:val="Heading1"/>
+      </w:pPr>
+      <w:r>
+        <w:t>7. Integraciones externas</w:t>
+      </w:r>
+    </w:p>
+    <w:p>
+      <w:pPr>
+        <w:pStyle w:val="ListBullet"/>
+      </w:pPr>
+      <w:r>
+        <w:rPr>
+          <w:b/>
+        </w:rPr>
+        <w:t>Mercado Pago</w:t>
+      </w:r>
+      <w:r>
+        <w:rPr>
+          <w:b w:val="0"/>
+        </w:rPr>
+        <w:t>: QR dinámico, IPN con firma HMAC x-signature, verificación de pago.</w:t>
+      </w:r>
+    </w:p>
+    <w:p>
+      <w:pPr>
+        <w:pStyle w:val="ListBullet"/>
+      </w:pPr>
+      <w:r>
+        <w:rPr>
+          <w:b/>
+        </w:rPr>
+        <w:t>Transbank Webpay Plus</w:t>
+      </w:r>
+      <w:r>
+        <w:rPr>
+          <w:b w:val="0"/>
+        </w:rPr>
+        <w:t>: credenciales sandbox, buy_order, flujo de commit por webhook.</w:t>
+      </w:r>
+    </w:p>
+    <w:p>
+      <w:pPr>
+        <w:pStyle w:val="ListBullet"/>
+      </w:pPr>
+      <w:r>
+        <w:rPr>
+          <w:b/>
+        </w:rPr>
+        <w:t>SII (extra)</w:t>
+      </w:r>
+      <w:r>
+        <w:rPr>
+          <w:b w:val="0"/>
+        </w:rPr>
+        <w:t>: Boleta código 39, Factura código 33, SOAP DTEUpload, Modo Contingencia con reintento.</w:t>
       </w:r>
     </w:p>
     <w:p>
@@ -525,7 +862,92 @@
         <w:t>Delivery omnicanal</w:t>
       </w:r>
       <w:r>
-        <w:t xml:space="preserve"> (Uber Eats / PedidosYa / Justo): ya presente como mock en el front; requiere evaluación de integración real en MVP.</w:t>
+        <w:rPr>
+          <w:b w:val="0"/>
+        </w:rPr>
+        <w:t xml:space="preserve"> (Uber Eats/PedidosYa/Justo): mock existente, integración real a evaluar.</w:t>
+      </w:r>
+    </w:p>
+    <w:p>
+      <w:pPr>
+        <w:pStyle w:val="Heading1"/>
+      </w:pPr>
+      <w:r>
+        <w:t>8. Definition of Done (MVP 31 oct)</w:t>
+      </w:r>
+    </w:p>
+    <w:p>
+      <w:pPr>
+        <w:pStyle w:val="ListBullet"/>
+      </w:pPr>
+      <w:r>
+        <w:rPr>
+          <w:b w:val="0"/>
+        </w:rPr>
+        <w:t>Arqueo/cierre de caja funcional con doble jornada y turnos (tras decidir el modelo).</w:t>
+      </w:r>
+    </w:p>
+    <w:p>
+      <w:pPr>
+        <w:pStyle w:val="ListBullet"/>
+      </w:pPr>
+      <w:r>
+        <w:rPr>
+          <w:b w:val="0"/>
+        </w:rPr>
+        <w:t>Comensal QR: escanea, se une, pide, ve subtotal, paga (con la entidad del comensal y el flujo GUEST).</w:t>
+      </w:r>
+    </w:p>
+    <w:p>
+      <w:pPr>
+        <w:pStyle w:val="ListBullet"/>
+      </w:pPr>
+      <w:r>
+        <w:rPr>
+          <w:b w:val="0"/>
+        </w:rPr>
+        <w:t>Pagos reales en sandbox (Mercado Pago; Transbank al escalar).</w:t>
+      </w:r>
+    </w:p>
+    <w:p>
+      <w:pPr>
+        <w:pStyle w:val="ListBullet"/>
+      </w:pPr>
+      <w:r>
+        <w:rPr>
+          <w:b w:val="0"/>
+        </w:rPr>
+        <w:t>Modificadores y devoluciones operando; manejo de errores por turno.</w:t>
+      </w:r>
+    </w:p>
+    <w:p>
+      <w:pPr>
+        <w:pStyle w:val="ListBullet"/>
+      </w:pPr>
+      <w:r>
+        <w:rPr>
+          <w:b w:val="0"/>
+        </w:rPr>
+        <w:t>Tests de integración contra PostgreSQL real (Testcontainers), nunca H2.</w:t>
+      </w:r>
+    </w:p>
+    <w:p>
+      <w:pPr>
+        <w:pStyle w:val="ListBullet"/>
+      </w:pPr>
+      <w:r>
+        <w:rPr>
+          <w:b w:val="0"/>
+        </w:rPr>
+        <w:t>Criterios de aceptación escritos antes de empezar; demo funcional quincenal.</w:t>
+      </w:r>
+    </w:p>
+    <w:p>
+      <w:pPr>
+        <w:pStyle w:val="Heading1"/>
+      </w:pPr>
+      <w:r>
+        <w:t>9. Riesgos y decisiones pendientes</w:t>
       </w:r>
     </w:p>
     <w:p>
@@ -536,23 +958,13 @@
         <w:rPr>
           <w:b/>
         </w:rPr>
-        <w:t>Patrón Strategy</w:t>
+        <w:t>Arqueo/caja</w:t>
       </w:r>
       <w:r>
-        <w:t xml:space="preserve"> (PaymentGatewayStrategy): para agregar Apple Pay/Google Pay/Stripe después sin tocar PAYMENT/PaymentServiceImpl.</w:t>
-      </w:r>
-    </w:p>
-    <w:p>
-      <w:pPr>
-        <w:pStyle w:val="Heading1"/>
-      </w:pPr>
-      <w:r>
-        <w:t>6. Plan por fases</w:t>
-      </w:r>
-    </w:p>
-    <w:p>
-      <w:r>
-        <w:t>El patrón de Alfa se repite (capa completa → siguiente dominio, 9 fases: Model → DTO → Repository → Service → ServiceImpl → Mapper → Controller → Transversales → Test). Orden de dominios por dependencia:</w:t>
+        <w:rPr>
+          <w:b w:val="0"/>
+        </w:rPr>
+        <w:t>: sin entidad en el modelo de 29; hay que modelar CASH_DRAWER/SHIFT o definir alcance (pregunta-arquitectura).</w:t>
       </w:r>
     </w:p>
     <w:p>
@@ -563,10 +975,13 @@
         <w:rPr>
           <w:b/>
         </w:rPr>
-        <w:t xml:space="preserve">1. Fase 0 — Decisiones y saneamiento: </w:t>
+        <w:t>Stack móvil</w:t>
       </w:r>
       <w:r>
-        <w:t>decidir alcance de RRHH; reconciliar courseType/enums (los docs dicen "start_now"/"in_15" y valores en minúscula; el código usa ENTRADA/FONDO/POSTRE y UPPER_SNAKE_CASE); crear los enums faltantes (SiiStatusEnum, ReservationStatusEnum, ServiceRequestStatusEnum, ServiceRequestTypeEnum, TaxDocumentTypeEnum, y ChannelEnum si aplica); cerrar los gaps de spec (PAYMENT_METHOD y FAVORITE sin endpoint).</w:t>
+        <w:rPr>
+          <w:b w:val="0"/>
+        </w:rPr>
+        <w:t>: el cliente sugiere React Native/Expo; definir si la app descargable (31 dic) usa eso o se evalúa.</w:t>
       </w:r>
     </w:p>
     <w:p>
@@ -577,10 +992,13 @@
         <w:rPr>
           <w:b/>
         </w:rPr>
-        <w:t>2. Inventario y recetas</w:t>
+        <w:t>DTE/SII</w:t>
       </w:r>
       <w:r>
-        <w:t xml:space="preserve"> (STOCK_ITEM → RECIPE_INGREDIENT): fundacional; RECIPE_INGREDIENT depende de DISH (Alfa) y STOCK_ITEM; el costeo es precondición de What-if/Costo Primario.</w:t>
+        <w:rPr>
+          <w:b w:val="0"/>
+        </w:rPr>
+        <w:t>: no está en la propuesta, pero en Chile toda venta legal requiere boleta/factura; conviene confirmar con el cliente si el MVP lo necesita (implicancia de cumplimiento).</w:t>
       </w:r>
     </w:p>
     <w:p>
@@ -591,10 +1009,13 @@
         <w:rPr>
           <w:b/>
         </w:rPr>
-        <w:t>3. Reservas</w:t>
+        <w:t>RRHH y "extra"</w:t>
       </w:r>
       <w:r>
-        <w:t xml:space="preserve"> (RESERVATION): independiente; depende solo de Alfa (BRANCH, DINING_TABLE, PERSON).</w:t>
+        <w:rPr>
+          <w:b w:val="0"/>
+        </w:rPr>
+        <w:t>: priorizar después del MVP para no distraer del alcance contratado.</w:t>
       </w:r>
     </w:p>
     <w:p>
@@ -605,283 +1026,13 @@
         <w:rPr>
           <w:b/>
         </w:rPr>
-        <w:t>4. S.O.S.</w:t>
+        <w:t>Diseño externo</w:t>
       </w:r>
       <w:r>
-        <w:t xml:space="preserve"> (SERVICE_REQUEST): depende de DINE_SESSION; reutiliza el patrón de publishers WebSocket existente.</w:t>
-      </w:r>
-    </w:p>
-    <w:p>
-      <w:pPr>
-        <w:pStyle w:val="ListBullet"/>
-      </w:pPr>
-      <w:r>
         <w:rPr>
-          <w:b/>
+          <w:b w:val="0"/>
         </w:rPr>
-        <w:t>5. Feedback y favoritos</w:t>
-      </w:r>
-      <w:r>
-        <w:t xml:space="preserve"> (DINE_FEEDBACK, FAVORITE): depende de DINE_SESSION/PERSON/BRANCH; independiente de los demás dominios.</w:t>
-      </w:r>
-    </w:p>
-    <w:p>
-      <w:pPr>
-        <w:pStyle w:val="ListBullet"/>
-      </w:pPr>
-      <w:r>
-        <w:rPr>
-          <w:b/>
-        </w:rPr>
-        <w:t>6. DTE / SII + medios de pago</w:t>
-      </w:r>
-      <w:r>
-        <w:t xml:space="preserve"> (TAX_DOCUMENT, SII_CAF_POOL, PAYMENT_METHOD): máxima complejidad (SII/Transbank/MercadoPago, lock pesimista de CAF, scheduler de contingencia, firma de webhook). Después de los dominios simples.</w:t>
-      </w:r>
-    </w:p>
-    <w:p>
-      <w:pPr>
-        <w:pStyle w:val="ListBullet"/>
-      </w:pPr>
-      <w:r>
-        <w:rPr>
-          <w:b/>
-        </w:rPr>
-        <w:t xml:space="preserve">7. What-if / análisis: </w:t>
-      </w:r>
-      <w:r>
-        <w:t>sin entidad nueva; después del paso 2 (consume costeo de recetas).</w:t>
-      </w:r>
-    </w:p>
-    <w:p>
-      <w:pPr>
-        <w:pStyle w:val="ListBullet"/>
-      </w:pPr>
-      <w:r>
-        <w:rPr>
-          <w:b/>
-        </w:rPr>
-        <w:t xml:space="preserve">8. RRHH: </w:t>
-      </w:r>
-      <w:r>
-        <w:t>después de la decisión de arquitectura.</w:t>
-      </w:r>
-    </w:p>
-    <w:p>
-      <w:r>
-        <w:t>Los pasos 3, 4 y 5 son mutuamente independientes y pueden avanzar en paralelo. 1, 2, 6, 7 y 8 son secuenciales respecto a sus dependencias.</w:t>
-      </w:r>
-    </w:p>
-    <w:p>
-      <w:pPr>
-        <w:pStyle w:val="Heading1"/>
-      </w:pPr>
-      <w:r>
-        <w:t>7. Definition of Done (MVP)</w:t>
-      </w:r>
-    </w:p>
-    <w:p>
-      <w:pPr>
-        <w:pStyle w:val="ListBullet"/>
-      </w:pPr>
-      <w:r>
-        <w:t>Los 9 dominios/entidades implementados por capa completa, con el patrón de Alfa (branch_id en toda query de tablas con branch_id; rol desde COMPANY_ROLE/BRANCH_ROLE; PIN + @Auditable donde corresponda).</w:t>
-      </w:r>
-    </w:p>
-    <w:p>
-      <w:pPr>
-        <w:pStyle w:val="ListBullet"/>
-      </w:pPr>
-      <w:r>
-        <w:t>Endpoints MVP responden según rest-api.md (ya reconciliado en Fase 0).</w:t>
-      </w:r>
-    </w:p>
-    <w:p>
-      <w:pPr>
-        <w:pStyle w:val="ListBullet"/>
-      </w:pPr>
-      <w:r>
-        <w:t>Integraciones externas probadas en sandbox (SII/Transbank/MercadoPago) con Modo Contingencia verificado.</w:t>
-      </w:r>
-    </w:p>
-    <w:p>
-      <w:pPr>
-        <w:pStyle w:val="ListBullet"/>
-      </w:pPr>
-      <w:r>
-        <w:t>Tests de integración contra PostgreSQL real (Testcontainers), nunca H2.</w:t>
-      </w:r>
-    </w:p>
-    <w:p>
-      <w:pPr>
-        <w:pStyle w:val="ListBullet"/>
-      </w:pPr>
-      <w:r>
-        <w:t>Webhook de pagos con firma HMAC verificada.</w:t>
-      </w:r>
-    </w:p>
-    <w:p>
-      <w:pPr>
-        <w:pStyle w:val="ListBullet"/>
-      </w:pPr>
-      <w:r>
-        <w:t>Documentación (.docx + openspec) actualizada al cierre.</w:t>
-      </w:r>
-    </w:p>
-    <w:p>
-      <w:pPr>
-        <w:pStyle w:val="Heading1"/>
-      </w:pPr>
-      <w:r>
-        <w:t>8. Gaps y decisiones pendientes</w:t>
-      </w:r>
-    </w:p>
-    <w:p>
-      <w:pPr>
-        <w:pStyle w:val="ListBullet"/>
-      </w:pPr>
-      <w:r>
-        <w:rPr>
-          <w:b/>
-        </w:rPr>
-        <w:t>PAYMENT_METHOD sin endpoint REST</w:t>
-      </w:r>
-      <w:r>
-        <w:t xml:space="preserve"> documentado: se crea como efecto secundario del pago; definir endpoint explícito.</w:t>
-      </w:r>
-    </w:p>
-    <w:p>
-      <w:pPr>
-        <w:pStyle w:val="ListBullet"/>
-      </w:pPr>
-      <w:r>
-        <w:rPr>
-          <w:b/>
-        </w:rPr>
-        <w:t>FAVORITE sin endpoint REST</w:t>
-      </w:r>
-      <w:r>
-        <w:t xml:space="preserve"> documentado: definir POST/DELETE /favorites.</w:t>
-      </w:r>
-    </w:p>
-    <w:p>
-      <w:pPr>
-        <w:pStyle w:val="ListBullet"/>
-      </w:pPr>
-      <w:r>
-        <w:rPr>
-          <w:b/>
-        </w:rPr>
-        <w:t>RRHH sin entidad</w:t>
-      </w:r>
-      <w:r>
-        <w:t xml:space="preserve"> en el modelo de 29: decisión de arquitectura.</w:t>
-      </w:r>
-    </w:p>
-    <w:p>
-      <w:pPr>
-        <w:pStyle w:val="ListBullet"/>
-      </w:pPr>
-      <w:r>
-        <w:rPr>
-          <w:b/>
-        </w:rPr>
-        <w:t>Enums faltantes</w:t>
-      </w:r>
-      <w:r>
-        <w:t xml:space="preserve"> (SiiStatusEnum, ReservationStatusEnum, ServiceRequestStatusEnum, ServiceRequestTypeEnum, TaxDocumentTypeEnum, ChannelEnum): crear en Fase 0.</w:t>
-      </w:r>
-    </w:p>
-    <w:p>
-      <w:pPr>
-        <w:pStyle w:val="ListBullet"/>
-      </w:pPr>
-      <w:r>
-        <w:rPr>
-          <w:b/>
-        </w:rPr>
-        <w:t xml:space="preserve">courseType/enums: </w:t>
-      </w:r>
-      <w:r>
-        <w:t>reconciliar (sección 6, Fase 0).</w:t>
-      </w:r>
-    </w:p>
-    <w:p>
-      <w:pPr>
-        <w:pStyle w:val="ListBullet"/>
-      </w:pPr>
-      <w:r>
-        <w:rPr>
-          <w:b/>
-        </w:rPr>
-        <w:t xml:space="preserve">Drift de ExceptionEventTypeEnum: </w:t>
-      </w:r>
-      <w:r>
-        <w:t>el diagrama lista refund/drawer_open_no_sale; el código usa REFUND_ISSUED/DRAWER_OPENED_NO_SALE.</w:t>
-      </w:r>
-    </w:p>
-    <w:p>
-      <w:pPr>
-        <w:pStyle w:val="Heading1"/>
-      </w:pPr>
-      <w:r>
-        <w:t>9. Riesgos</w:t>
-      </w:r>
-    </w:p>
-    <w:p>
-      <w:pPr>
-        <w:pStyle w:val="ListBullet"/>
-      </w:pPr>
-      <w:r>
-        <w:rPr>
-          <w:b/>
-        </w:rPr>
-        <w:t xml:space="preserve">DTE/SII: </w:t>
-      </w:r>
-      <w:r>
-        <w:t>dependencia de servicios externos y certificación SII; mitigación con Modo Contingencia y sandbox.</w:t>
-      </w:r>
-    </w:p>
-    <w:p>
-      <w:pPr>
-        <w:pStyle w:val="ListBullet"/>
-      </w:pPr>
-      <w:r>
-        <w:rPr>
-          <w:b/>
-        </w:rPr>
-        <w:t xml:space="preserve">Delivery omnicanal: </w:t>
-      </w:r>
-      <w:r>
-        <w:t>alcance e integración real no definidos; requiere decisión de producto.</w:t>
-      </w:r>
-    </w:p>
-    <w:p>
-      <w:pPr>
-        <w:pStyle w:val="ListBullet"/>
-      </w:pPr>
-      <w:r>
-        <w:rPr>
-          <w:b/>
-        </w:rPr>
-        <w:t xml:space="preserve">RRHH: </w:t>
-      </w:r>
-      <w:r>
-        <w:t>sin entidad en la fuente de verdad; puede reabrir el alcance.</w:t>
-      </w:r>
-    </w:p>
-    <w:p>
-      <w:pPr>
-        <w:pStyle w:val="ListBullet"/>
-      </w:pPr>
-      <w:r>
-        <w:rPr>
-          <w:b/>
-        </w:rPr>
-        <w:t xml:space="preserve">Costeo de recetas: </w:t>
-      </w:r>
-      <w:r>
-        <w:t>si las fichas técnicas no están costeadas, What-if y Costo Primario quedan bloqueados.</w:t>
+        <w:t>: coordinar para que el trabajo de datos/lógica/seguridad no se bloquee si el diseño se atrasa.</w:t>
       </w:r>
     </w:p>
     <w:sectPr>

</xml_diff>